<commit_message>
COMMIT FINALE 2.0 (modifica alla documentazione)
</commit_message>
<xml_diff>
--- a/doc/documentazione-progetto-compilata.docx
+++ b/doc/documentazione-progetto-compilata.docx
@@ -277,7 +277,7 @@
               </mc:Choice>
               <mc:Fallback>
                 <w:pict>
-                  <v:line w14:anchorId="4B3BC337" id="Connettore diritto 42" o:spid="_x0000_s1026" style="position:absolute;z-index:251655680;visibility:visible;mso-wrap-style:square;mso-width-percent:0;mso-wrap-distance-left:9pt;mso-wrap-distance-top:0;mso-wrap-distance-right:9pt;mso-wrap-distance-bottom:0;mso-position-horizontal:absolute;mso-position-horizontal-relative:text;mso-position-vertical:absolute;mso-position-vertical-relative:text;mso-width-percent:0;mso-width-relative:margin" from=".15pt,.6pt" to="425.55pt,.6pt" o:gfxdata="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" strokecolor="#4472c4 [3204]" strokeweight="1.75pt">
+                  <v:line w14:anchorId="6D533A31" id="Connettore diritto 42" o:spid="_x0000_s1026" style="position:absolute;z-index:251655680;visibility:visible;mso-wrap-style:square;mso-width-percent:0;mso-wrap-distance-left:9pt;mso-wrap-distance-top:0;mso-wrap-distance-right:9pt;mso-wrap-distance-bottom:0;mso-position-horizontal:absolute;mso-position-horizontal-relative:text;mso-position-vertical:absolute;mso-position-vertical-relative:text;mso-width-percent:0;mso-width-relative:margin" from=".15pt,.6pt" to="425.55pt,.6pt" o:gfxdata="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" strokecolor="#4472c4 [3204]" strokeweight="1.75pt">
                     <v:stroke joinstyle="miter"/>
                   </v:line>
                 </w:pict>
@@ -911,7 +911,7 @@
               </mc:Choice>
               <mc:Fallback>
                 <w:pict>
-                  <v:line w14:anchorId="38AC3B55" id="Connettore diritto 43" o:spid="_x0000_s1026" style="position:absolute;z-index:251695616;visibility:visible;mso-wrap-style:square;mso-width-percent:0;mso-wrap-distance-left:9pt;mso-wrap-distance-top:0;mso-wrap-distance-right:9pt;mso-wrap-distance-bottom:0;mso-position-horizontal:absolute;mso-position-horizontal-relative:text;mso-position-vertical:absolute;mso-position-vertical-relative:text;mso-width-percent:0;mso-width-relative:margin" from=".15pt,6.05pt" to="425.55pt,6.05pt" o:gfxdata="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" strokecolor="#4472c4 [3204]" strokeweight="1.5pt">
+                  <v:line w14:anchorId="6343925A" id="Connettore diritto 43" o:spid="_x0000_s1026" style="position:absolute;z-index:251695616;visibility:visible;mso-wrap-style:square;mso-width-percent:0;mso-wrap-distance-left:9pt;mso-wrap-distance-top:0;mso-wrap-distance-right:9pt;mso-wrap-distance-bottom:0;mso-position-horizontal:absolute;mso-position-horizontal-relative:text;mso-position-vertical:absolute;mso-position-vertical-relative:text;mso-width-percent:0;mso-width-relative:margin" from=".15pt,6.05pt" to="425.55pt,6.05pt" o:gfxdata="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" strokecolor="#4472c4 [3204]" strokeweight="1.5pt">
                     <v:stroke joinstyle="miter"/>
                   </v:line>
                 </w:pict>
@@ -2668,7 +2668,6 @@
       <w:pPr>
         <w:rPr>
           <w:rFonts w:cstheme="minorHAnsi"/>
-          <w:u w:val="single"/>
         </w:rPr>
       </w:pPr>
       <w:r>
@@ -2702,6 +2701,20 @@
           <w:rFonts w:cstheme="minorHAnsi"/>
         </w:rPr>
         <w:t>;</w:t>
+      </w:r>
+    </w:p>
+    <w:p>
+      <w:pPr>
+        <w:rPr>
+          <w:rFonts w:cstheme="minorHAnsi"/>
+          <w:u w:val="single"/>
+        </w:rPr>
+      </w:pPr>
+      <w:r>
+        <w:rPr>
+          <w:rFonts w:cstheme="minorHAnsi"/>
+        </w:rPr>
+        <w:t>- durante la deserializzazione, alle volte alcune immagini non vengono recuperate</w:t>
       </w:r>
     </w:p>
     <w:p>
@@ -7498,7 +7511,12 @@
 </file>
 
 <file path=customXml/item1.xml><?xml version="1.0" encoding="utf-8"?>
-<b:Sources xmlns:b="http://schemas.openxmlformats.org/officeDocument/2006/bibliography" xmlns="http://schemas.openxmlformats.org/officeDocument/2006/bibliography" SelectedStyle="\APASixthEditionOfficeOnline.xsl" StyleName="APA" Version="6"/>
+<?mso-contentType ?>
+<FormTemplates xmlns="http://schemas.microsoft.com/sharepoint/v3/contenttype/forms">
+  <Display>DocumentLibraryForm</Display>
+  <Edit>DocumentLibraryForm</Edit>
+  <New>DocumentLibraryForm</New>
+</FormTemplates>
 </file>
 
 <file path=customXml/item2.xml><?xml version="1.0" encoding="utf-8"?>
@@ -7508,12 +7526,7 @@
 </file>
 
 <file path=customXml/item3.xml><?xml version="1.0" encoding="utf-8"?>
-<?mso-contentType ?>
-<FormTemplates xmlns="http://schemas.microsoft.com/sharepoint/v3/contenttype/forms">
-  <Display>DocumentLibraryForm</Display>
-  <Edit>DocumentLibraryForm</Edit>
-  <New>DocumentLibraryForm</New>
-</FormTemplates>
+<b:Sources xmlns:b="http://schemas.openxmlformats.org/officeDocument/2006/bibliography" xmlns="http://schemas.openxmlformats.org/officeDocument/2006/bibliography" SelectedStyle="\APASixthEditionOfficeOnline.xsl" StyleName="APA" Version="6"/>
 </file>
 
 <file path=customXml/item4.xml><?xml version="1.0" encoding="utf-8"?>
@@ -7649,9 +7662,9 @@
 </file>
 
 <file path=customXml/itemProps1.xml><?xml version="1.0" encoding="utf-8"?>
-<ds:datastoreItem xmlns:ds="http://schemas.openxmlformats.org/officeDocument/2006/customXml" ds:itemID="{393FEEA6-D434-4B28-B035-556EB66551F6}">
+<ds:datastoreItem xmlns:ds="http://schemas.openxmlformats.org/officeDocument/2006/customXml" ds:itemID="{1EAFE88E-C664-4910-9D3E-159EF4530FAE}">
   <ds:schemaRefs>
-    <ds:schemaRef ds:uri="http://schemas.openxmlformats.org/officeDocument/2006/bibliography"/>
+    <ds:schemaRef ds:uri="http://schemas.microsoft.com/sharepoint/v3/contenttype/forms"/>
   </ds:schemaRefs>
 </ds:datastoreItem>
 </file>
@@ -7666,9 +7679,9 @@
 </file>
 
 <file path=customXml/itemProps3.xml><?xml version="1.0" encoding="utf-8"?>
-<ds:datastoreItem xmlns:ds="http://schemas.openxmlformats.org/officeDocument/2006/customXml" ds:itemID="{1EAFE88E-C664-4910-9D3E-159EF4530FAE}">
+<ds:datastoreItem xmlns:ds="http://schemas.openxmlformats.org/officeDocument/2006/customXml" ds:itemID="{393FEEA6-D434-4B28-B035-556EB66551F6}">
   <ds:schemaRefs>
-    <ds:schemaRef ds:uri="http://schemas.microsoft.com/sharepoint/v3/contenttype/forms"/>
+    <ds:schemaRef ds:uri="http://schemas.openxmlformats.org/officeDocument/2006/bibliography"/>
   </ds:schemaRefs>
 </ds:datastoreItem>
 </file>

</xml_diff>